<commit_message>
Embed student screenshots into Task 1 Word report document
</commit_message>
<xml_diff>
--- a/Portfolio WP2/1_Unjuk_Kerja Mengimplementasikan Pemrograman Terstruktur - Nugraha Jody.docx
+++ b/Portfolio WP2/1_Unjuk_Kerja Mengimplementasikan Pemrograman Terstruktur - Nugraha Jody.docx
@@ -162,7 +162,7 @@
     </w:p>
     <w:p>
       <w:pPr>
-        <w:spacing w:before="160" w:after="480"/>
+        <w:spacing w:before="160" w:after="360"/>
         <w:jc w:val="center"/>
       </w:pPr>
       <w:r>
@@ -284,17 +284,42 @@
     </w:p>
     <w:p>
       <w:pPr>
-        <w:spacing w:before="160" w:after="480"/>
+        <w:spacing w:before="160" w:after="360"/>
         <w:jc w:val="center"/>
       </w:pPr>
       <w:r>
-        <w:rPr>
-          <w:rFonts w:ascii="Arial" w:hAnsi="Arial"/>
-          <w:b/>
-          <w:color w:val="EF4444"/>
-          <w:sz w:val="22"/>
-        </w:rPr>
-        <w:t>[ TEMPEL SCREENSHOT OUTPUT DI SINI ]</w:t>
+        <w:drawing>
+          <wp:inline xmlns:a="http://schemas.openxmlformats.org/drawingml/2006/main" xmlns:pic="http://schemas.openxmlformats.org/drawingml/2006/picture">
+            <wp:extent cx="4754880" cy="1889469"/>
+            <wp:docPr id="1" name="Picture 1"/>
+            <wp:cNvGraphicFramePr>
+              <a:graphicFrameLocks noChangeAspect="1"/>
+            </wp:cNvGraphicFramePr>
+            <a:graphic>
+              <a:graphicData uri="http://schemas.openxmlformats.org/drawingml/2006/picture">
+                <pic:pic>
+                  <pic:nvPicPr>
+                    <pic:cNvPr id="0" name="media__1783239486797.png"/>
+                    <pic:cNvPicPr/>
+                  </pic:nvPicPr>
+                  <pic:blipFill>
+                    <a:blip r:embed="rId9"/>
+                    <a:stretch>
+                      <a:fillRect/>
+                    </a:stretch>
+                  </pic:blipFill>
+                  <pic:spPr>
+                    <a:xfrm>
+                      <a:off x="0" y="0"/>
+                      <a:ext cx="4754880" cy="1889469"/>
+                    </a:xfrm>
+                    <a:prstGeom prst="rect"/>
+                  </pic:spPr>
+                </pic:pic>
+              </a:graphicData>
+            </a:graphic>
+          </wp:inline>
+        </w:drawing>
       </w:r>
     </w:p>
     <w:p>
@@ -306,10 +331,10 @@
         <w:rPr>
           <w:rFonts w:ascii="Arial" w:hAnsi="Arial"/>
           <w:i/>
-          <w:color w:val="94A3B8"/>
+          <w:color w:val="64748B"/>
           <w:sz w:val="18"/>
         </w:rPr>
-        <w:t>(Silakan ambil screenshot dari terminal PowerShell ketika program dijalankan, lalu tempel di atas)</w:t>
+        <w:t>(Screenshot Output Program untuk Tampilan import os)</w:t>
       </w:r>
     </w:p>
     <w:p>
@@ -406,17 +431,42 @@
     </w:p>
     <w:p>
       <w:pPr>
-        <w:spacing w:before="160" w:after="480"/>
+        <w:spacing w:before="160" w:after="360"/>
         <w:jc w:val="center"/>
       </w:pPr>
       <w:r>
-        <w:rPr>
-          <w:rFonts w:ascii="Arial" w:hAnsi="Arial"/>
-          <w:b/>
-          <w:color w:val="EF4444"/>
-          <w:sz w:val="22"/>
-        </w:rPr>
-        <w:t>[ TEMPEL SCREENSHOT OUTPUT DI SINI ]</w:t>
+        <w:drawing>
+          <wp:inline xmlns:a="http://schemas.openxmlformats.org/drawingml/2006/main" xmlns:pic="http://schemas.openxmlformats.org/drawingml/2006/picture">
+            <wp:extent cx="4754880" cy="2019118"/>
+            <wp:docPr id="2" name="Picture 2"/>
+            <wp:cNvGraphicFramePr>
+              <a:graphicFrameLocks noChangeAspect="1"/>
+            </wp:cNvGraphicFramePr>
+            <a:graphic>
+              <a:graphicData uri="http://schemas.openxmlformats.org/drawingml/2006/picture">
+                <pic:pic>
+                  <pic:nvPicPr>
+                    <pic:cNvPr id="0" name="media__1783239509970.png"/>
+                    <pic:cNvPicPr/>
+                  </pic:nvPicPr>
+                  <pic:blipFill>
+                    <a:blip r:embed="rId10"/>
+                    <a:stretch>
+                      <a:fillRect/>
+                    </a:stretch>
+                  </pic:blipFill>
+                  <pic:spPr>
+                    <a:xfrm>
+                      <a:off x="0" y="0"/>
+                      <a:ext cx="4754880" cy="2019118"/>
+                    </a:xfrm>
+                    <a:prstGeom prst="rect"/>
+                  </pic:spPr>
+                </pic:pic>
+              </a:graphicData>
+            </a:graphic>
+          </wp:inline>
+        </w:drawing>
       </w:r>
     </w:p>
     <w:p>
@@ -428,10 +478,10 @@
         <w:rPr>
           <w:rFonts w:ascii="Arial" w:hAnsi="Arial"/>
           <w:i/>
-          <w:color w:val="94A3B8"/>
+          <w:color w:val="64748B"/>
           <w:sz w:val="18"/>
         </w:rPr>
-        <w:t>(Silakan ambil screenshot dari terminal PowerShell ketika program dijalankan, lalu tempel di atas)</w:t>
+        <w:t>(Screenshot Output Program untuk Tampilan import sys)</w:t>
       </w:r>
     </w:p>
     <w:p>
@@ -546,17 +596,42 @@
     </w:p>
     <w:p>
       <w:pPr>
-        <w:spacing w:before="160" w:after="480"/>
+        <w:spacing w:before="160" w:after="360"/>
         <w:jc w:val="center"/>
       </w:pPr>
       <w:r>
-        <w:rPr>
-          <w:rFonts w:ascii="Arial" w:hAnsi="Arial"/>
-          <w:b/>
-          <w:color w:val="EF4444"/>
-          <w:sz w:val="22"/>
-        </w:rPr>
-        <w:t>[ TEMPEL SCREENSHOT OUTPUT DI SINI ]</w:t>
+        <w:drawing>
+          <wp:inline xmlns:a="http://schemas.openxmlformats.org/drawingml/2006/main" xmlns:pic="http://schemas.openxmlformats.org/drawingml/2006/picture">
+            <wp:extent cx="4754880" cy="2946206"/>
+            <wp:docPr id="3" name="Picture 3"/>
+            <wp:cNvGraphicFramePr>
+              <a:graphicFrameLocks noChangeAspect="1"/>
+            </wp:cNvGraphicFramePr>
+            <a:graphic>
+              <a:graphicData uri="http://schemas.openxmlformats.org/drawingml/2006/picture">
+                <pic:pic>
+                  <pic:nvPicPr>
+                    <pic:cNvPr id="0" name="media__1783239524896.png"/>
+                    <pic:cNvPicPr/>
+                  </pic:nvPicPr>
+                  <pic:blipFill>
+                    <a:blip r:embed="rId11"/>
+                    <a:stretch>
+                      <a:fillRect/>
+                    </a:stretch>
+                  </pic:blipFill>
+                  <pic:spPr>
+                    <a:xfrm>
+                      <a:off x="0" y="0"/>
+                      <a:ext cx="4754880" cy="2946206"/>
+                    </a:xfrm>
+                    <a:prstGeom prst="rect"/>
+                  </pic:spPr>
+                </pic:pic>
+              </a:graphicData>
+            </a:graphic>
+          </wp:inline>
+        </w:drawing>
       </w:r>
     </w:p>
     <w:p>
@@ -568,10 +643,10 @@
         <w:rPr>
           <w:rFonts w:ascii="Arial" w:hAnsi="Arial"/>
           <w:i/>
-          <w:color w:val="94A3B8"/>
+          <w:color w:val="64748B"/>
           <w:sz w:val="18"/>
         </w:rPr>
-        <w:t>(Silakan ambil screenshot dari terminal PowerShell ketika program dijalankan, lalu tempel di atas)</w:t>
+        <w:t>(Screenshot Output Program untuk Tampilan Class (OOP))</w:t>
       </w:r>
     </w:p>
     <w:p>
@@ -669,7 +744,7 @@
     </w:p>
     <w:p>
       <w:pPr>
-        <w:spacing w:before="160" w:after="480"/>
+        <w:spacing w:before="160" w:after="360"/>
         <w:jc w:val="center"/>
       </w:pPr>
       <w:r>
@@ -788,17 +863,42 @@
     </w:p>
     <w:p>
       <w:pPr>
-        <w:spacing w:before="160" w:after="480"/>
+        <w:spacing w:before="160" w:after="360"/>
         <w:jc w:val="center"/>
       </w:pPr>
       <w:r>
-        <w:rPr>
-          <w:rFonts w:ascii="Arial" w:hAnsi="Arial"/>
-          <w:b/>
-          <w:color w:val="EF4444"/>
-          <w:sz w:val="22"/>
-        </w:rPr>
-        <w:t>[ TEMPEL SCREENSHOT OUTPUT DI SINI ]</w:t>
+        <w:drawing>
+          <wp:inline xmlns:a="http://schemas.openxmlformats.org/drawingml/2006/main" xmlns:pic="http://schemas.openxmlformats.org/drawingml/2006/picture">
+            <wp:extent cx="4754880" cy="2087788"/>
+            <wp:docPr id="4" name="Picture 4"/>
+            <wp:cNvGraphicFramePr>
+              <a:graphicFrameLocks noChangeAspect="1"/>
+            </wp:cNvGraphicFramePr>
+            <a:graphic>
+              <a:graphicData uri="http://schemas.openxmlformats.org/drawingml/2006/picture">
+                <pic:pic>
+                  <pic:nvPicPr>
+                    <pic:cNvPr id="0" name="media__1783239582021.png"/>
+                    <pic:cNvPicPr/>
+                  </pic:nvPicPr>
+                  <pic:blipFill>
+                    <a:blip r:embed="rId12"/>
+                    <a:stretch>
+                      <a:fillRect/>
+                    </a:stretch>
+                  </pic:blipFill>
+                  <pic:spPr>
+                    <a:xfrm>
+                      <a:off x="0" y="0"/>
+                      <a:ext cx="4754880" cy="2087788"/>
+                    </a:xfrm>
+                    <a:prstGeom prst="rect"/>
+                  </pic:spPr>
+                </pic:pic>
+              </a:graphicData>
+            </a:graphic>
+          </wp:inline>
+        </w:drawing>
       </w:r>
     </w:p>
     <w:p>
@@ -810,10 +910,10 @@
         <w:rPr>
           <w:rFonts w:ascii="Arial" w:hAnsi="Arial"/>
           <w:i/>
-          <w:color w:val="94A3B8"/>
+          <w:color w:val="64748B"/>
           <w:sz w:val="18"/>
         </w:rPr>
-        <w:t>(Silakan ambil screenshot dari terminal PowerShell ketika program dijalankan, lalu tempel di atas)</w:t>
+        <w:t>(Screenshot Output Program untuk Tampilan Variable)</w:t>
       </w:r>
     </w:p>
     <w:p>
@@ -917,7 +1017,7 @@
     </w:p>
     <w:p>
       <w:pPr>
-        <w:spacing w:before="160" w:after="480"/>
+        <w:spacing w:before="160" w:after="360"/>
         <w:jc w:val="center"/>
       </w:pPr>
       <w:r>
@@ -1062,7 +1162,7 @@
     </w:p>
     <w:p>
       <w:pPr>
-        <w:spacing w:before="160" w:after="480"/>
+        <w:spacing w:before="160" w:after="360"/>
         <w:jc w:val="center"/>
       </w:pPr>
       <w:r>
@@ -1198,7 +1298,7 @@
     </w:p>
     <w:p>
       <w:pPr>
-        <w:spacing w:before="160" w:after="480"/>
+        <w:spacing w:before="160" w:after="360"/>
         <w:jc w:val="center"/>
       </w:pPr>
       <w:r>
@@ -1327,7 +1427,7 @@
     </w:p>
     <w:p>
       <w:pPr>
-        <w:spacing w:before="160" w:after="480"/>
+        <w:spacing w:before="160" w:after="360"/>
         <w:jc w:val="center"/>
       </w:pPr>
       <w:r>
@@ -1459,7 +1559,7 @@
     </w:p>
     <w:p>
       <w:pPr>
-        <w:spacing w:before="160" w:after="480"/>
+        <w:spacing w:before="160" w:after="360"/>
         <w:jc w:val="center"/>
       </w:pPr>
       <w:r>
@@ -1580,17 +1680,42 @@
     </w:p>
     <w:p>
       <w:pPr>
-        <w:spacing w:before="160" w:after="480"/>
+        <w:spacing w:before="160" w:after="360"/>
         <w:jc w:val="center"/>
       </w:pPr>
       <w:r>
-        <w:rPr>
-          <w:rFonts w:ascii="Arial" w:hAnsi="Arial"/>
-          <w:b/>
-          <w:color w:val="EF4444"/>
-          <w:sz w:val="22"/>
-        </w:rPr>
-        <w:t>[ TEMPEL SCREENSHOT OUTPUT DI SINI ]</w:t>
+        <w:drawing>
+          <wp:inline xmlns:a="http://schemas.openxmlformats.org/drawingml/2006/main" xmlns:pic="http://schemas.openxmlformats.org/drawingml/2006/picture">
+            <wp:extent cx="4754880" cy="2225810"/>
+            <wp:docPr id="5" name="Picture 5"/>
+            <wp:cNvGraphicFramePr>
+              <a:graphicFrameLocks noChangeAspect="1"/>
+            </wp:cNvGraphicFramePr>
+            <a:graphic>
+              <a:graphicData uri="http://schemas.openxmlformats.org/drawingml/2006/picture">
+                <pic:pic>
+                  <pic:nvPicPr>
+                    <pic:cNvPr id="0" name="media__1783239468725.png"/>
+                    <pic:cNvPicPr/>
+                  </pic:nvPicPr>
+                  <pic:blipFill>
+                    <a:blip r:embed="rId13"/>
+                    <a:stretch>
+                      <a:fillRect/>
+                    </a:stretch>
+                  </pic:blipFill>
+                  <pic:spPr>
+                    <a:xfrm>
+                      <a:off x="0" y="0"/>
+                      <a:ext cx="4754880" cy="2225810"/>
+                    </a:xfrm>
+                    <a:prstGeom prst="rect"/>
+                  </pic:spPr>
+                </pic:pic>
+              </a:graphicData>
+            </a:graphic>
+          </wp:inline>
+        </w:drawing>
       </w:r>
     </w:p>
     <w:p>
@@ -1602,10 +1727,10 @@
         <w:rPr>
           <w:rFonts w:ascii="Arial" w:hAnsi="Arial"/>
           <w:i/>
-          <w:color w:val="94A3B8"/>
+          <w:color w:val="64748B"/>
           <w:sz w:val="18"/>
         </w:rPr>
-        <w:t>(Silakan ambil screenshot dari terminal PowerShell ketika program dijalankan, lalu tempel di atas)</w:t>
+        <w:t>(Screenshot Output Program untuk Tampilan Komentar)</w:t>
       </w:r>
     </w:p>
     <w:sectPr>

</xml_diff>

<commit_message>
Complete Task 1 Word report document with all transaction screenshots embedded
</commit_message>
<xml_diff>
--- a/Portfolio WP2/1_Unjuk_Kerja Mengimplementasikan Pemrograman Terstruktur - Nugraha Jody.docx
+++ b/Portfolio WP2/1_Unjuk_Kerja Mengimplementasikan Pemrograman Terstruktur - Nugraha Jody.docx
@@ -166,13 +166,38 @@
         <w:jc w:val="center"/>
       </w:pPr>
       <w:r>
-        <w:rPr>
-          <w:rFonts w:ascii="Arial" w:hAnsi="Arial"/>
-          <w:b/>
-          <w:color w:val="EF4444"/>
-          <w:sz w:val="22"/>
-        </w:rPr>
-        <w:t>[ TEMPEL SCREENSHOT OUTPUT DI SINI ]</w:t>
+        <w:drawing>
+          <wp:inline xmlns:a="http://schemas.openxmlformats.org/drawingml/2006/main" xmlns:pic="http://schemas.openxmlformats.org/drawingml/2006/picture">
+            <wp:extent cx="4754880" cy="2272344"/>
+            <wp:docPr id="1" name="Picture 1"/>
+            <wp:cNvGraphicFramePr>
+              <a:graphicFrameLocks noChangeAspect="1"/>
+            </wp:cNvGraphicFramePr>
+            <a:graphic>
+              <a:graphicData uri="http://schemas.openxmlformats.org/drawingml/2006/picture">
+                <pic:pic>
+                  <pic:nvPicPr>
+                    <pic:cNvPr id="0" name="media__1783239789335.png"/>
+                    <pic:cNvPicPr/>
+                  </pic:nvPicPr>
+                  <pic:blipFill>
+                    <a:blip r:embed="rId9"/>
+                    <a:stretch>
+                      <a:fillRect/>
+                    </a:stretch>
+                  </pic:blipFill>
+                  <pic:spPr>
+                    <a:xfrm>
+                      <a:off x="0" y="0"/>
+                      <a:ext cx="4754880" cy="2272344"/>
+                    </a:xfrm>
+                    <a:prstGeom prst="rect"/>
+                  </pic:spPr>
+                </pic:pic>
+              </a:graphicData>
+            </a:graphic>
+          </wp:inline>
+        </w:drawing>
       </w:r>
     </w:p>
     <w:p>
@@ -184,10 +209,10 @@
         <w:rPr>
           <w:rFonts w:ascii="Arial" w:hAnsi="Arial"/>
           <w:i/>
-          <w:color w:val="94A3B8"/>
+          <w:color w:val="64748B"/>
           <w:sz w:val="18"/>
         </w:rPr>
-        <w:t>(Silakan ambil screenshot dari terminal PowerShell ketika program dijalankan, lalu tempel di atas)</w:t>
+        <w:t>(Screenshot Output Program untuk Tampilan Perintah Print)</w:t>
       </w:r>
     </w:p>
     <w:p>
@@ -291,7 +316,7 @@
         <w:drawing>
           <wp:inline xmlns:a="http://schemas.openxmlformats.org/drawingml/2006/main" xmlns:pic="http://schemas.openxmlformats.org/drawingml/2006/picture">
             <wp:extent cx="4754880" cy="1889469"/>
-            <wp:docPr id="1" name="Picture 1"/>
+            <wp:docPr id="2" name="Picture 2"/>
             <wp:cNvGraphicFramePr>
               <a:graphicFrameLocks noChangeAspect="1"/>
             </wp:cNvGraphicFramePr>
@@ -303,7 +328,7 @@
                     <pic:cNvPicPr/>
                   </pic:nvPicPr>
                   <pic:blipFill>
-                    <a:blip r:embed="rId9"/>
+                    <a:blip r:embed="rId10"/>
                     <a:stretch>
                       <a:fillRect/>
                     </a:stretch>
@@ -438,7 +463,7 @@
         <w:drawing>
           <wp:inline xmlns:a="http://schemas.openxmlformats.org/drawingml/2006/main" xmlns:pic="http://schemas.openxmlformats.org/drawingml/2006/picture">
             <wp:extent cx="4754880" cy="2019118"/>
-            <wp:docPr id="2" name="Picture 2"/>
+            <wp:docPr id="3" name="Picture 3"/>
             <wp:cNvGraphicFramePr>
               <a:graphicFrameLocks noChangeAspect="1"/>
             </wp:cNvGraphicFramePr>
@@ -450,7 +475,7 @@
                     <pic:cNvPicPr/>
                   </pic:nvPicPr>
                   <pic:blipFill>
-                    <a:blip r:embed="rId10"/>
+                    <a:blip r:embed="rId11"/>
                     <a:stretch>
                       <a:fillRect/>
                     </a:stretch>
@@ -603,7 +628,7 @@
         <w:drawing>
           <wp:inline xmlns:a="http://schemas.openxmlformats.org/drawingml/2006/main" xmlns:pic="http://schemas.openxmlformats.org/drawingml/2006/picture">
             <wp:extent cx="4754880" cy="2946206"/>
-            <wp:docPr id="3" name="Picture 3"/>
+            <wp:docPr id="4" name="Picture 4"/>
             <wp:cNvGraphicFramePr>
               <a:graphicFrameLocks noChangeAspect="1"/>
             </wp:cNvGraphicFramePr>
@@ -615,7 +640,7 @@
                     <pic:cNvPicPr/>
                   </pic:nvPicPr>
                   <pic:blipFill>
-                    <a:blip r:embed="rId11"/>
+                    <a:blip r:embed="rId12"/>
                     <a:stretch>
                       <a:fillRect/>
                     </a:stretch>
@@ -748,13 +773,38 @@
         <w:jc w:val="center"/>
       </w:pPr>
       <w:r>
-        <w:rPr>
-          <w:rFonts w:ascii="Arial" w:hAnsi="Arial"/>
-          <w:b/>
-          <w:color w:val="EF4444"/>
-          <w:sz w:val="22"/>
-        </w:rPr>
-        <w:t>[ TEMPEL SCREENSHOT OUTPUT DI SINI ]</w:t>
+        <w:drawing>
+          <wp:inline xmlns:a="http://schemas.openxmlformats.org/drawingml/2006/main" xmlns:pic="http://schemas.openxmlformats.org/drawingml/2006/picture">
+            <wp:extent cx="4754880" cy="2272344"/>
+            <wp:docPr id="5" name="Picture 5"/>
+            <wp:cNvGraphicFramePr>
+              <a:graphicFrameLocks noChangeAspect="1"/>
+            </wp:cNvGraphicFramePr>
+            <a:graphic>
+              <a:graphicData uri="http://schemas.openxmlformats.org/drawingml/2006/picture">
+                <pic:pic>
+                  <pic:nvPicPr>
+                    <pic:cNvPr id="0" name="media__1783239789335.png"/>
+                    <pic:cNvPicPr/>
+                  </pic:nvPicPr>
+                  <pic:blipFill>
+                    <a:blip r:embed="rId9"/>
+                    <a:stretch>
+                      <a:fillRect/>
+                    </a:stretch>
+                  </pic:blipFill>
+                  <pic:spPr>
+                    <a:xfrm>
+                      <a:off x="0" y="0"/>
+                      <a:ext cx="4754880" cy="2272344"/>
+                    </a:xfrm>
+                    <a:prstGeom prst="rect"/>
+                  </pic:spPr>
+                </pic:pic>
+              </a:graphicData>
+            </a:graphic>
+          </wp:inline>
+        </w:drawing>
       </w:r>
     </w:p>
     <w:p>
@@ -766,10 +816,10 @@
         <w:rPr>
           <w:rFonts w:ascii="Arial" w:hAnsi="Arial"/>
           <w:i/>
-          <w:color w:val="94A3B8"/>
+          <w:color w:val="64748B"/>
           <w:sz w:val="18"/>
         </w:rPr>
-        <w:t>(Silakan ambil screenshot dari terminal PowerShell ketika program dijalankan, lalu tempel di atas)</w:t>
+        <w:t>(Screenshot Output Program untuk Tampilan Function)</w:t>
       </w:r>
     </w:p>
     <w:p>
@@ -870,7 +920,7 @@
         <w:drawing>
           <wp:inline xmlns:a="http://schemas.openxmlformats.org/drawingml/2006/main" xmlns:pic="http://schemas.openxmlformats.org/drawingml/2006/picture">
             <wp:extent cx="4754880" cy="2087788"/>
-            <wp:docPr id="4" name="Picture 4"/>
+            <wp:docPr id="6" name="Picture 6"/>
             <wp:cNvGraphicFramePr>
               <a:graphicFrameLocks noChangeAspect="1"/>
             </wp:cNvGraphicFramePr>
@@ -882,7 +932,7 @@
                     <pic:cNvPicPr/>
                   </pic:nvPicPr>
                   <pic:blipFill>
-                    <a:blip r:embed="rId12"/>
+                    <a:blip r:embed="rId13"/>
                     <a:stretch>
                       <a:fillRect/>
                     </a:stretch>
@@ -1021,13 +1071,38 @@
         <w:jc w:val="center"/>
       </w:pPr>
       <w:r>
-        <w:rPr>
-          <w:rFonts w:ascii="Arial" w:hAnsi="Arial"/>
-          <w:b/>
-          <w:color w:val="EF4444"/>
-          <w:sz w:val="22"/>
-        </w:rPr>
-        <w:t>[ TEMPEL SCREENSHOT OUTPUT DI SINI ]</w:t>
+        <w:drawing>
+          <wp:inline xmlns:a="http://schemas.openxmlformats.org/drawingml/2006/main" xmlns:pic="http://schemas.openxmlformats.org/drawingml/2006/picture">
+            <wp:extent cx="4754880" cy="2801369"/>
+            <wp:docPr id="7" name="Picture 7"/>
+            <wp:cNvGraphicFramePr>
+              <a:graphicFrameLocks noChangeAspect="1"/>
+            </wp:cNvGraphicFramePr>
+            <a:graphic>
+              <a:graphicData uri="http://schemas.openxmlformats.org/drawingml/2006/picture">
+                <pic:pic>
+                  <pic:nvPicPr>
+                    <pic:cNvPr id="0" name="media__1783239768070.png"/>
+                    <pic:cNvPicPr/>
+                  </pic:nvPicPr>
+                  <pic:blipFill>
+                    <a:blip r:embed="rId14"/>
+                    <a:stretch>
+                      <a:fillRect/>
+                    </a:stretch>
+                  </pic:blipFill>
+                  <pic:spPr>
+                    <a:xfrm>
+                      <a:off x="0" y="0"/>
+                      <a:ext cx="4754880" cy="2801369"/>
+                    </a:xfrm>
+                    <a:prstGeom prst="rect"/>
+                  </pic:spPr>
+                </pic:pic>
+              </a:graphicData>
+            </a:graphic>
+          </wp:inline>
+        </w:drawing>
       </w:r>
     </w:p>
     <w:p>
@@ -1039,10 +1114,10 @@
         <w:rPr>
           <w:rFonts w:ascii="Arial" w:hAnsi="Arial"/>
           <w:i/>
-          <w:color w:val="94A3B8"/>
+          <w:color w:val="64748B"/>
           <w:sz w:val="18"/>
         </w:rPr>
-        <w:t>(Silakan ambil screenshot dari terminal PowerShell ketika program dijalankan, lalu tempel di atas)</w:t>
+        <w:t>(Screenshot Output Program untuk Tampilan Perulangan (Looping))</w:t>
       </w:r>
     </w:p>
     <w:p>
@@ -1166,13 +1241,38 @@
         <w:jc w:val="center"/>
       </w:pPr>
       <w:r>
-        <w:rPr>
-          <w:rFonts w:ascii="Arial" w:hAnsi="Arial"/>
-          <w:b/>
-          <w:color w:val="EF4444"/>
-          <w:sz w:val="22"/>
-        </w:rPr>
-        <w:t>[ TEMPEL SCREENSHOT OUTPUT DI SINI ]</w:t>
+        <w:drawing>
+          <wp:inline xmlns:a="http://schemas.openxmlformats.org/drawingml/2006/main" xmlns:pic="http://schemas.openxmlformats.org/drawingml/2006/picture">
+            <wp:extent cx="4754880" cy="2801369"/>
+            <wp:docPr id="8" name="Picture 8"/>
+            <wp:cNvGraphicFramePr>
+              <a:graphicFrameLocks noChangeAspect="1"/>
+            </wp:cNvGraphicFramePr>
+            <a:graphic>
+              <a:graphicData uri="http://schemas.openxmlformats.org/drawingml/2006/picture">
+                <pic:pic>
+                  <pic:nvPicPr>
+                    <pic:cNvPr id="0" name="media__1783239768070.png"/>
+                    <pic:cNvPicPr/>
+                  </pic:nvPicPr>
+                  <pic:blipFill>
+                    <a:blip r:embed="rId14"/>
+                    <a:stretch>
+                      <a:fillRect/>
+                    </a:stretch>
+                  </pic:blipFill>
+                  <pic:spPr>
+                    <a:xfrm>
+                      <a:off x="0" y="0"/>
+                      <a:ext cx="4754880" cy="2801369"/>
+                    </a:xfrm>
+                    <a:prstGeom prst="rect"/>
+                  </pic:spPr>
+                </pic:pic>
+              </a:graphicData>
+            </a:graphic>
+          </wp:inline>
+        </w:drawing>
       </w:r>
     </w:p>
     <w:p>
@@ -1184,10 +1284,10 @@
         <w:rPr>
           <w:rFonts w:ascii="Arial" w:hAnsi="Arial"/>
           <w:i/>
-          <w:color w:val="94A3B8"/>
+          <w:color w:val="64748B"/>
           <w:sz w:val="18"/>
         </w:rPr>
-        <w:t>(Silakan ambil screenshot dari terminal PowerShell ketika program dijalankan, lalu tempel di atas)</w:t>
+        <w:t>(Screenshot Output Program untuk Tampilan Percabangan)</w:t>
       </w:r>
     </w:p>
     <w:p>
@@ -1302,13 +1402,38 @@
         <w:jc w:val="center"/>
       </w:pPr>
       <w:r>
-        <w:rPr>
-          <w:rFonts w:ascii="Arial" w:hAnsi="Arial"/>
-          <w:b/>
-          <w:color w:val="EF4444"/>
-          <w:sz w:val="22"/>
-        </w:rPr>
-        <w:t>[ TEMPEL SCREENSHOT OUTPUT DI SINI ]</w:t>
+        <w:drawing>
+          <wp:inline xmlns:a="http://schemas.openxmlformats.org/drawingml/2006/main" xmlns:pic="http://schemas.openxmlformats.org/drawingml/2006/picture">
+            <wp:extent cx="4754880" cy="2272344"/>
+            <wp:docPr id="9" name="Picture 9"/>
+            <wp:cNvGraphicFramePr>
+              <a:graphicFrameLocks noChangeAspect="1"/>
+            </wp:cNvGraphicFramePr>
+            <a:graphic>
+              <a:graphicData uri="http://schemas.openxmlformats.org/drawingml/2006/picture">
+                <pic:pic>
+                  <pic:nvPicPr>
+                    <pic:cNvPr id="0" name="media__1783239789335.png"/>
+                    <pic:cNvPicPr/>
+                  </pic:nvPicPr>
+                  <pic:blipFill>
+                    <a:blip r:embed="rId9"/>
+                    <a:stretch>
+                      <a:fillRect/>
+                    </a:stretch>
+                  </pic:blipFill>
+                  <pic:spPr>
+                    <a:xfrm>
+                      <a:off x="0" y="0"/>
+                      <a:ext cx="4754880" cy="2272344"/>
+                    </a:xfrm>
+                    <a:prstGeom prst="rect"/>
+                  </pic:spPr>
+                </pic:pic>
+              </a:graphicData>
+            </a:graphic>
+          </wp:inline>
+        </w:drawing>
       </w:r>
     </w:p>
     <w:p>
@@ -1320,10 +1445,10 @@
         <w:rPr>
           <w:rFonts w:ascii="Arial" w:hAnsi="Arial"/>
           <w:i/>
-          <w:color w:val="94A3B8"/>
+          <w:color w:val="64748B"/>
           <w:sz w:val="18"/>
         </w:rPr>
-        <w:t>(Silakan ambil screenshot dari terminal PowerShell ketika program dijalankan, lalu tempel di atas)</w:t>
+        <w:t>(Screenshot Output Program untuk Tampilan Library Pandas)</w:t>
       </w:r>
     </w:p>
     <w:p>
@@ -1431,13 +1556,38 @@
         <w:jc w:val="center"/>
       </w:pPr>
       <w:r>
-        <w:rPr>
-          <w:rFonts w:ascii="Arial" w:hAnsi="Arial"/>
-          <w:b/>
-          <w:color w:val="EF4444"/>
-          <w:sz w:val="22"/>
-        </w:rPr>
-        <w:t>[ TEMPEL SCREENSHOT OUTPUT DI SINI ]</w:t>
+        <w:drawing>
+          <wp:inline xmlns:a="http://schemas.openxmlformats.org/drawingml/2006/main" xmlns:pic="http://schemas.openxmlformats.org/drawingml/2006/picture">
+            <wp:extent cx="4754880" cy="2272344"/>
+            <wp:docPr id="10" name="Picture 10"/>
+            <wp:cNvGraphicFramePr>
+              <a:graphicFrameLocks noChangeAspect="1"/>
+            </wp:cNvGraphicFramePr>
+            <a:graphic>
+              <a:graphicData uri="http://schemas.openxmlformats.org/drawingml/2006/picture">
+                <pic:pic>
+                  <pic:nvPicPr>
+                    <pic:cNvPr id="0" name="media__1783239789335.png"/>
+                    <pic:cNvPicPr/>
+                  </pic:nvPicPr>
+                  <pic:blipFill>
+                    <a:blip r:embed="rId9"/>
+                    <a:stretch>
+                      <a:fillRect/>
+                    </a:stretch>
+                  </pic:blipFill>
+                  <pic:spPr>
+                    <a:xfrm>
+                      <a:off x="0" y="0"/>
+                      <a:ext cx="4754880" cy="2272344"/>
+                    </a:xfrm>
+                    <a:prstGeom prst="rect"/>
+                  </pic:spPr>
+                </pic:pic>
+              </a:graphicData>
+            </a:graphic>
+          </wp:inline>
+        </w:drawing>
       </w:r>
     </w:p>
     <w:p>
@@ -1449,10 +1599,10 @@
         <w:rPr>
           <w:rFonts w:ascii="Arial" w:hAnsi="Arial"/>
           <w:i/>
-          <w:color w:val="94A3B8"/>
+          <w:color w:val="64748B"/>
           <w:sz w:val="18"/>
         </w:rPr>
-        <w:t>(Silakan ambil screenshot dari terminal PowerShell ketika program dijalankan, lalu tempel di atas)</w:t>
+        <w:t>(Screenshot Output Program untuk Tampilan Operator Aritmatika)</w:t>
       </w:r>
     </w:p>
     <w:p>
@@ -1563,13 +1713,38 @@
         <w:jc w:val="center"/>
       </w:pPr>
       <w:r>
-        <w:rPr>
-          <w:rFonts w:ascii="Arial" w:hAnsi="Arial"/>
-          <w:b/>
-          <w:color w:val="EF4444"/>
-          <w:sz w:val="22"/>
-        </w:rPr>
-        <w:t>[ TEMPEL SCREENSHOT OUTPUT DI SINI ]</w:t>
+        <w:drawing>
+          <wp:inline xmlns:a="http://schemas.openxmlformats.org/drawingml/2006/main" xmlns:pic="http://schemas.openxmlformats.org/drawingml/2006/picture">
+            <wp:extent cx="4754880" cy="2801369"/>
+            <wp:docPr id="11" name="Picture 11"/>
+            <wp:cNvGraphicFramePr>
+              <a:graphicFrameLocks noChangeAspect="1"/>
+            </wp:cNvGraphicFramePr>
+            <a:graphic>
+              <a:graphicData uri="http://schemas.openxmlformats.org/drawingml/2006/picture">
+                <pic:pic>
+                  <pic:nvPicPr>
+                    <pic:cNvPr id="0" name="media__1783239768070.png"/>
+                    <pic:cNvPicPr/>
+                  </pic:nvPicPr>
+                  <pic:blipFill>
+                    <a:blip r:embed="rId14"/>
+                    <a:stretch>
+                      <a:fillRect/>
+                    </a:stretch>
+                  </pic:blipFill>
+                  <pic:spPr>
+                    <a:xfrm>
+                      <a:off x="0" y="0"/>
+                      <a:ext cx="4754880" cy="2801369"/>
+                    </a:xfrm>
+                    <a:prstGeom prst="rect"/>
+                  </pic:spPr>
+                </pic:pic>
+              </a:graphicData>
+            </a:graphic>
+          </wp:inline>
+        </w:drawing>
       </w:r>
     </w:p>
     <w:p>
@@ -1581,10 +1756,10 @@
         <w:rPr>
           <w:rFonts w:ascii="Arial" w:hAnsi="Arial"/>
           <w:i/>
-          <w:color w:val="94A3B8"/>
+          <w:color w:val="64748B"/>
           <w:sz w:val="18"/>
         </w:rPr>
-        <w:t>(Silakan ambil screenshot dari terminal PowerShell ketika program dijalankan, lalu tempel di atas)</w:t>
+        <w:t>(Screenshot Output Program untuk Tampilan Array (List))</w:t>
       </w:r>
     </w:p>
     <w:p>
@@ -1687,7 +1862,7 @@
         <w:drawing>
           <wp:inline xmlns:a="http://schemas.openxmlformats.org/drawingml/2006/main" xmlns:pic="http://schemas.openxmlformats.org/drawingml/2006/picture">
             <wp:extent cx="4754880" cy="2225810"/>
-            <wp:docPr id="5" name="Picture 5"/>
+            <wp:docPr id="12" name="Picture 12"/>
             <wp:cNvGraphicFramePr>
               <a:graphicFrameLocks noChangeAspect="1"/>
             </wp:cNvGraphicFramePr>
@@ -1699,7 +1874,7 @@
                     <pic:cNvPicPr/>
                   </pic:nvPicPr>
                   <pic:blipFill>
-                    <a:blip r:embed="rId13"/>
+                    <a:blip r:embed="rId15"/>
                     <a:stretch>
                       <a:fillRect/>
                     </a:stretch>

</xml_diff>